<commit_message>
FISC motion brief: docx/reference.xml (the court styles on pandoc's reference, the page-number footer and the section) replaces build-reference.sh and the committed reference.docx; byte-identical .docx.pdf with the old face, then the face is the typst template's ({font}, theme-font too: Liberation Serif, docs/FONTS.md for a court that names none) for EB Garamond and pandoc's Aptos theme face; fb lint fonts no longer reports the folder; page counts unchanged (4 and 5); check.sh typst and docx 0 failed, XENG-001 pass (fb-595.68.4)
</commit_message>
<xml_diff>
--- a/courts/national/foreign-intelligence-surveillance-court/motion-brief/usage/OUTPUT-motion-brief-2.docx
+++ b/courts/national/foreign-intelligence-surveillance-court/motion-brief/usage/OUTPUT-motion-brief-2.docx
@@ -881,6 +881,48 @@
     </w:pPrDefault>
   </w:docDefaults>
   <w:latentStyles w:defLockedState="0" w:defUIPriority="0" w:defSemiHidden="0" w:defUnhideWhenUsed="0" w:defQFormat="0" w:count="276"/>
+  <w:style w:type="paragraph" w:default="1" w:styleId="Normal">
+    <w:name w:val="Normal"/>
+    <w:qFormat/>
+    <w:pPr>
+      <w:spacing w:before="0" w:after="0" w:line="240" w:lineRule="auto"/>
+      <w:ind w:firstLine="0"/>
+    </w:pPr>
+    <w:rPr>
+      <w:rFonts w:ascii="Liberation Serif" w:hAnsi="Liberation Serif" w:eastAsia="Liberation Serif" w:cs="Liberation Serif"/>
+      <w:sz w:val="24"/>
+      <w:szCs w:val="24"/>
+      <w:lang w:val="en-US"/>
+    </w:rPr>
+  </w:style>
+  <w:style w:type="paragraph" w:styleId="BodyText">
+    <w:name w:val="Body Text"/>
+    <w:basedOn w:val="Normal"/>
+    <w:qFormat/>
+    <w:pPr>
+      <w:spacing w:before="0" w:after="0" w:line="480" w:lineRule="exact"/>
+      <w:ind w:firstLine="720"/>
+    </w:pPr>
+  </w:style>
+  <w:style w:type="paragraph" w:styleId="FirstParagraph">
+    <w:name w:val="First Paragraph"/>
+    <w:basedOn w:val="BodyText"/>
+    <w:next w:val="BodyText"/>
+    <w:qFormat/>
+    <w:pPr>
+      <w:spacing w:before="0" w:after="0" w:line="480" w:lineRule="exact"/>
+      <w:ind w:firstLine="720"/>
+    </w:pPr>
+  </w:style>
+  <w:style w:type="paragraph" w:styleId="Compact">
+    <w:name w:val="Compact"/>
+    <w:basedOn w:val="BodyText"/>
+    <w:qFormat/>
+    <w:pPr>
+      <w:spacing w:before="0" w:after="0" w:line="480" w:lineRule="exact"/>
+      <w:ind w:firstLine="0"/>
+    </w:pPr>
+  </w:style>
   <w:style w:type="paragraph" w:styleId="Title">
     <w:name w:val="Title"/>
     <w:basedOn w:val="Normal"/>
@@ -1013,6 +1055,77 @@
     <w:qFormat/>
     <w:pPr/>
     <w:rPr/>
+  </w:style>
+  <w:style w:type="paragraph" w:styleId="Heading1">
+    <w:name w:val="heading 1"/>
+    <w:basedOn w:val="Normal"/>
+    <w:next w:val="BodyNoIndent"/>
+    <w:uiPriority w:val="9"/>
+    <w:qFormat/>
+    <w:pPr>
+      <w:keepNext/>
+      <w:keepLines/>
+      <w:spacing w:before="288" w:after="216" w:line="312" w:lineRule="exact"/>
+      <w:ind w:left="0" w:firstLine="0"/>
+      <w:outlineLvl w:val="0"/>
+    </w:pPr>
+    <w:rPr>
+      <w:b/>
+      <w:bCs/>
+      <w:i w:val="0"/>
+      <w:color w:val="000000"/>
+      <w:rFonts w:ascii="Liberation Serif" w:hAnsi="Liberation Serif" w:eastAsia="Liberation Serif" w:cs="Liberation Serif"/>
+      <w:sz w:val="24"/>
+      <w:szCs w:val="24"/>
+    </w:rPr>
+  </w:style>
+  <w:style w:type="paragraph" w:styleId="Heading2">
+    <w:name w:val="heading 2"/>
+    <w:basedOn w:val="Normal"/>
+    <w:next w:val="BodyNoIndent"/>
+    <w:uiPriority w:val="9"/>
+    <w:unhideWhenUsed/>
+    <w:qFormat/>
+    <w:pPr>
+      <w:keepNext/>
+      <w:keepLines/>
+      <w:spacing w:before="288" w:after="216" w:line="312" w:lineRule="exact"/>
+      <w:ind w:left="0" w:firstLine="0"/>
+      <w:outlineLvl w:val="1"/>
+    </w:pPr>
+    <w:rPr>
+      <w:b/>
+      <w:bCs/>
+      <w:i w:val="0"/>
+      <w:color w:val="000000"/>
+      <w:rFonts w:ascii="Liberation Serif" w:hAnsi="Liberation Serif" w:eastAsia="Liberation Serif" w:cs="Liberation Serif"/>
+      <w:sz w:val="24"/>
+      <w:szCs w:val="24"/>
+    </w:rPr>
+  </w:style>
+  <w:style w:type="paragraph" w:styleId="Heading3">
+    <w:name w:val="heading 3"/>
+    <w:basedOn w:val="Normal"/>
+    <w:next w:val="BodyNoIndent"/>
+    <w:uiPriority w:val="9"/>
+    <w:unhideWhenUsed/>
+    <w:qFormat/>
+    <w:pPr>
+      <w:keepNext/>
+      <w:keepLines/>
+      <w:spacing w:before="288" w:after="216" w:line="312" w:lineRule="exact"/>
+      <w:ind w:left="0" w:firstLine="0"/>
+      <w:outlineLvl w:val="2"/>
+    </w:pPr>
+    <w:rPr>
+      <w:b/>
+      <w:bCs/>
+      <w:i w:val="0"/>
+      <w:color w:val="000000"/>
+      <w:rFonts w:ascii="Liberation Serif" w:hAnsi="Liberation Serif" w:eastAsia="Liberation Serif" w:cs="Liberation Serif"/>
+      <w:sz w:val="24"/>
+      <w:szCs w:val="24"/>
+    </w:rPr>
   </w:style>
   <w:style w:type="paragraph" w:styleId="Heading4">
     <w:name w:val="heading 4"/>
@@ -1263,6 +1376,29 @@
     <w:rPr>
       <w:rFonts w:eastAsiaTheme="majorEastAsia" w:cstheme="majorBidi"/>
       <w:color w:val="272727" w:themeColor="text1" w:themeTint="D8"/>
+    </w:rPr>
+  </w:style>
+  <w:style w:type="paragraph" w:styleId="BlockText">
+    <w:name w:val="Block Text"/>
+    <w:basedOn w:val="Normal"/>
+    <w:qFormat/>
+    <w:pPr>
+      <w:spacing w:before="0" w:after="240" w:line="312" w:lineRule="exact"/>
+      <w:ind w:left="720" w:right="720" w:firstLine="0"/>
+    </w:pPr>
+  </w:style>
+  <w:style w:type="paragraph" w:styleId="FootnoteText">
+    <w:name w:val="footnote text"/>
+    <w:basedOn w:val="Normal"/>
+    <w:uiPriority w:val="99"/>
+    <w:unhideWhenUsed/>
+    <w:pPr>
+      <w:spacing w:before="0" w:after="60" w:line="240" w:lineRule="auto"/>
+      <w:ind w:firstLine="0"/>
+    </w:pPr>
+    <w:rPr>
+      <w:sz w:val="18"/>
+      <w:szCs w:val="18"/>
     </w:rPr>
   </w:style>
   <w:style w:type="paragraph" w:styleId="FootnoteBlockText">
@@ -1403,39 +1539,6 @@
       <w:color w:val="365F91" w:themeColor="accent1" w:themeShade="BF"/>
     </w:rPr>
   </w:style>
-  <w:style w:type="paragraph" w:default="1" w:styleId="Normal">
-    <w:name w:val="Normal"/>
-    <w:qFormat/>
-    <w:pPr>
-      <w:spacing w:before="0" w:after="0" w:line="240" w:lineRule="auto"/>
-      <w:ind w:firstLine="0"/>
-    </w:pPr>
-    <w:rPr>
-      <w:rFonts w:ascii="EB Garamond" w:hAnsi="EB Garamond" w:eastAsia="EB Garamond" w:cs="EB Garamond"/>
-      <w:sz w:val="24"/>
-      <w:szCs w:val="24"/>
-      <w:lang w:val="en-US"/>
-    </w:rPr>
-  </w:style>
-  <w:style w:type="paragraph" w:styleId="BodyText">
-    <w:name w:val="Body Text"/>
-    <w:basedOn w:val="Normal"/>
-    <w:qFormat/>
-    <w:pPr>
-      <w:spacing w:before="0" w:after="0" w:line="480" w:lineRule="exact"/>
-      <w:ind w:firstLine="720"/>
-    </w:pPr>
-  </w:style>
-  <w:style w:type="paragraph" w:styleId="FirstParagraph">
-    <w:name w:val="First Paragraph"/>
-    <w:basedOn w:val="BodyText"/>
-    <w:next w:val="BodyText"/>
-    <w:qFormat/>
-    <w:pPr>
-      <w:spacing w:before="0" w:after="0" w:line="480" w:lineRule="exact"/>
-      <w:ind w:firstLine="720"/>
-    </w:pPr>
-  </w:style>
   <w:style w:type="paragraph" w:customStyle="1" w:styleId="BodyNoIndent">
     <w:name w:val="Body No Indent"/>
     <w:basedOn w:val="BodyText"/>
@@ -1443,109 +1546,6 @@
     <w:pPr>
       <w:ind w:firstLine="0"/>
     </w:pPr>
-  </w:style>
-  <w:style w:type="paragraph" w:styleId="Compact">
-    <w:name w:val="Compact"/>
-    <w:basedOn w:val="BodyText"/>
-    <w:qFormat/>
-    <w:pPr>
-      <w:spacing w:before="0" w:after="0" w:line="480" w:lineRule="exact"/>
-      <w:ind w:firstLine="0"/>
-    </w:pPr>
-  </w:style>
-  <w:style w:type="paragraph" w:styleId="Heading1">
-    <w:name w:val="heading 1"/>
-    <w:basedOn w:val="Normal"/>
-    <w:next w:val="BodyNoIndent"/>
-    <w:uiPriority w:val="9"/>
-    <w:qFormat/>
-    <w:pPr>
-      <w:keepNext/>
-      <w:keepLines/>
-      <w:spacing w:before="288" w:after="216" w:line="312" w:lineRule="exact"/>
-      <w:ind w:left="0" w:firstLine="0"/>
-      <w:outlineLvl w:val="0"/>
-    </w:pPr>
-    <w:rPr>
-      <w:b/>
-      <w:bCs/>
-      <w:i w:val="0"/>
-      <w:color w:val="000000"/>
-      <w:rFonts w:ascii="EB Garamond" w:hAnsi="EB Garamond" w:eastAsia="EB Garamond" w:cs="EB Garamond"/>
-      <w:sz w:val="24"/>
-      <w:szCs w:val="24"/>
-    </w:rPr>
-  </w:style>
-  <w:style w:type="paragraph" w:styleId="Heading2">
-    <w:name w:val="heading 2"/>
-    <w:basedOn w:val="Normal"/>
-    <w:next w:val="BodyNoIndent"/>
-    <w:uiPriority w:val="9"/>
-    <w:unhideWhenUsed/>
-    <w:qFormat/>
-    <w:pPr>
-      <w:keepNext/>
-      <w:keepLines/>
-      <w:spacing w:before="288" w:after="216" w:line="312" w:lineRule="exact"/>
-      <w:ind w:left="0" w:firstLine="0"/>
-      <w:outlineLvl w:val="1"/>
-    </w:pPr>
-    <w:rPr>
-      <w:b/>
-      <w:bCs/>
-      <w:i w:val="0"/>
-      <w:color w:val="000000"/>
-      <w:rFonts w:ascii="EB Garamond" w:hAnsi="EB Garamond" w:eastAsia="EB Garamond" w:cs="EB Garamond"/>
-      <w:sz w:val="24"/>
-      <w:szCs w:val="24"/>
-    </w:rPr>
-  </w:style>
-  <w:style w:type="paragraph" w:styleId="Heading3">
-    <w:name w:val="heading 3"/>
-    <w:basedOn w:val="Normal"/>
-    <w:next w:val="BodyNoIndent"/>
-    <w:uiPriority w:val="9"/>
-    <w:unhideWhenUsed/>
-    <w:qFormat/>
-    <w:pPr>
-      <w:keepNext/>
-      <w:keepLines/>
-      <w:spacing w:before="288" w:after="216" w:line="312" w:lineRule="exact"/>
-      <w:ind w:left="0" w:firstLine="0"/>
-      <w:outlineLvl w:val="2"/>
-    </w:pPr>
-    <w:rPr>
-      <w:b/>
-      <w:bCs/>
-      <w:i w:val="0"/>
-      <w:color w:val="000000"/>
-      <w:rFonts w:ascii="EB Garamond" w:hAnsi="EB Garamond" w:eastAsia="EB Garamond" w:cs="EB Garamond"/>
-      <w:sz w:val="24"/>
-      <w:szCs w:val="24"/>
-    </w:rPr>
-  </w:style>
-  <w:style w:type="paragraph" w:styleId="BlockText">
-    <w:name w:val="Block Text"/>
-    <w:basedOn w:val="Normal"/>
-    <w:qFormat/>
-    <w:pPr>
-      <w:spacing w:before="0" w:after="240" w:line="312" w:lineRule="exact"/>
-      <w:ind w:left="720" w:right="720" w:firstLine="0"/>
-    </w:pPr>
-  </w:style>
-  <w:style w:type="paragraph" w:styleId="FootnoteText">
-    <w:name w:val="footnote text"/>
-    <w:basedOn w:val="Normal"/>
-    <w:uiPriority w:val="99"/>
-    <w:unhideWhenUsed/>
-    <w:pPr>
-      <w:spacing w:before="0" w:after="60" w:line="240" w:lineRule="auto"/>
-      <w:ind w:firstLine="0"/>
-    </w:pPr>
-    <w:rPr>
-      <w:sz w:val="18"/>
-      <w:szCs w:val="18"/>
-    </w:rPr>
   </w:style>
   <w:style w:type="paragraph" w:customStyle="1" w:styleId="Centered">
     <w:name w:val="Centered"/>
@@ -1888,7 +1888,7 @@
     </a:clrScheme>
     <a:fontScheme name="Office">
       <a:majorFont>
-        <a:latin typeface="Aptos Display" panose="02110004020202020204"/>
+        <a:latin typeface="Liberation Serif" panose="02110004020202020204"/>
         <a:ea typeface=""/>
         <a:cs typeface=""/>
         <a:font script="Jpan" typeface="游ゴシック Light"/>
@@ -1940,7 +1940,7 @@
         <a:font script="Tfng" typeface="Ebrima"/>
       </a:majorFont>
       <a:minorFont>
-        <a:latin typeface="Aptos" panose="02110004020202020204"/>
+        <a:latin typeface="Liberation Serif" panose="02110004020202020204"/>
         <a:ea typeface=""/>
         <a:cs typeface=""/>
         <a:font script="Jpan" typeface="游明朝"/>

</xml_diff>